<commit_message>
Mailagent: Freigabeliste frei nutzbar (Max, 19.10.) — Kreuz im Auftragsformular entfällt, jede Eintragung durch die Verwaltung ist die gesonderte Vereinbarung nach § 6 Abs. 2 RDV
Anlage A 5.4 Abs. (1): Versandbedingungen aus dem Code (nexai-mailagent a95aa12,
src/entwurf/automatik.ts: keine Lücke/Rückfrage/Warnung/Platzhalter, Absender unauffällig,
kein Anweisungsversuch, keine Vier-Augen-Pflicht); Eintragung nur Rolle Verwaltung, protokolliert
(src/web/einstellungswege.ts: "Empfaenger fuer Versand freigegeben"). Vermerk zur technischen
Sperre entfällt. Haftungsklammer [Von Max zu entscheiden] bleibt.

Co-Authored-By: Claude Opus 5.5 <noreply@anthropic.com>
</commit_message>
<xml_diff>
--- a/vertrag/02_Auftragsformular_Leistungsschein.docx
+++ b/vertrag/02_Auftragsformular_Leistungsschein.docx
@@ -1760,46 +1760,6 @@
           <w:szCs w:val="21"/>
         </w:rPr>
         <w:t xml:space="preserve">Betrieb auf einem eigenen Server</w:t>
-      </w:r>
-    </w:p>
-    <w:p>
-      <w:pPr>
-        <w:spacing w:after="60"/>
-        <w:ind w:left="200"/>
-      </w:pPr>
-      <w:r>
-        <w:rPr>
-          <w:rFonts w:ascii="Arial" w:cs="Arial" w:eastAsia="Arial" w:hAnsi="Arial"/>
-          <w:sz w:val="24"/>
-          <w:szCs w:val="24"/>
-        </w:rPr>
-        <w:t xml:space="preserve">☐  </w:t>
-      </w:r>
-      <w:r>
-        <w:rPr>
-          <w:rFonts w:ascii="Arial" w:cs="Arial" w:eastAsia="Arial" w:hAnsi="Arial"/>
-          <w:b/>
-          <w:bCs/>
-          <w:i w:val="false"/>
-          <w:iCs w:val="false"/>
-          <w:color w:val="1A1A1A"/>
-          <w:sz w:val="21"/>
-          <w:szCs w:val="21"/>
-        </w:rPr>
-        <w:t xml:space="preserve">Selbsttätiger Versand</w:t>
-      </w:r>
-      <w:r>
-        <w:rPr>
-          <w:rFonts w:ascii="Arial" w:cs="Arial" w:eastAsia="Arial" w:hAnsi="Arial"/>
-          <w:b w:val="false"/>
-          <w:bCs w:val="false"/>
-          <w:i w:val="false"/>
-          <w:iCs w:val="false"/>
-          <w:color w:val="1A1A1A"/>
-          <w:sz w:val="21"/>
-          <w:szCs w:val="21"/>
-        </w:rPr>
-        <w:t xml:space="preserve"> von Antworten an Absender auf der Freigabeliste wird vereinbart (Anlage A Ziffer 5.4 Abs. (1) Satz 2; gesonderte Vereinbarung im Sinne von § 6 Abs. (2) des Rahmenvertrags).</w:t>
       </w:r>
     </w:p>
     <w:p>

</xml_diff>